<commit_message>
Dedicate original contributions under CC0 and publish AI disclosure throughout
</commit_message>
<xml_diff>
--- a/docs/Data_Dungeon_Book_Plan.docx
+++ b/docs/Data_Dungeon_Book_Plan.docx
@@ -82,7 +82,7 @@
         <w:rPr>
           <w:sz w:val="20"/>
         </w:rPr>
-        <w:t>AI disclosure: ChatGPT assisted with drafting, instructional design, and code. Decorative illustrations were generated with OpenAI image generation. Human review is required before classroom release.</w:t>
+        <w:t>AI-created, human-prompted, human-edited, and human-verified using ChatGPT (OpenAI). Artwork: OpenAI image generation. Original contributions: CC0 1.0. See Publication License and AI Disclosure at the end.</w:t>
       </w:r>
     </w:p>
     <w:p>
@@ -90,7 +90,7 @@
         <w:rPr>
           <w:sz w:val="20"/>
         </w:rPr>
-        <w:t>Format reference: Michael Penta, Companion Materials for OpenStax: Introduction to Python Programming, Chapter 5 (2025), supplied Word document marked CC0 1.0. This companion uses original Java activities. Publication license remains to be finalized.</w:t>
+        <w:t>Format reference: Michael Penta, Companion Materials for OpenStax: Introduction to Python Programming, Chapter 5 (2025), supplied Word document marked CC0 1.0. This companion uses original Java activities. Original contributions are dedicated under CC0 1.0.</w:t>
       </w:r>
     </w:p>
     <w:p>
@@ -401,7 +401,7 @@
     </w:p>
     <w:p>
       <w:r>
-        <w:t>For each finished chapter, provide a solution, assessment criteria, expected traces, common misconceptions, and an alternative when AI access is unavailable. Confirm exact reading sections, accessibility, tool availability, and licensing before publication. No paid subscription or API key should be required.</w:t>
+        <w:t>For each finished chapter, provide a solution, assessment criteria, expected traces, common misconceptions, and an alternative when AI access is unavailable. Confirm exact reading sections, accessibility and tool availability before classroom use. No paid subscription or API key should be required.</w:t>
       </w:r>
     </w:p>
     <w:p>
@@ -414,6 +414,73 @@
         <w:t>Textbook: https://opendatastructures.org/ods-java/</w:t>
         <w:br/>
         <w:t>Format inspiration: https://oercommons.org/courseware/lesson/139005</w:t>
+      </w:r>
+    </w:p>
+    <w:p>
+      <w:r>
+        <w:br w:type="page"/>
+      </w:r>
+    </w:p>
+    <w:p>
+      <w:pPr>
+        <w:pStyle w:val="Heading1"/>
+      </w:pPr>
+      <w:r>
+        <w:t>Publication License and AI Disclosure</w:t>
+      </w:r>
+    </w:p>
+    <w:p>
+      <w:pPr>
+        <w:pStyle w:val="Heading2"/>
+      </w:pPr>
+      <w:r>
+        <w:t>Open Reuse</w:t>
+      </w:r>
+    </w:p>
+    <w:p>
+      <w:r>
+        <w:t>To the extent the project rights holders own copyright or related rights, they dedicate the original contributions to Data Dungeon: The Linked Labyrinth to the public domain under CC0 1.0 Universal. This includes original teaching materials, Java code, verification code, and project artwork. You may copy, modify, redistribute, and use these contributions commercially. Attribution is appreciated but is not required for these CC0 contributions.</w:t>
+      </w:r>
+    </w:p>
+    <w:p>
+      <w:r>
+        <w:t>CC0 1.0 Universal: https://creativecommons.org/publicdomain/zero/1.0/</w:t>
+      </w:r>
+    </w:p>
+    <w:p>
+      <w:pPr>
+        <w:pStyle w:val="Heading2"/>
+      </w:pPr>
+      <w:r>
+        <w:t>Source Attribution and Exceptions</w:t>
+      </w:r>
+    </w:p>
+    <w:p>
+      <w:r>
+        <w:t>Pat Morin, Open Data Structures, Java edition: https://opendatastructures.org/ods-java/. The textbook and its accompanying source code are released under Creative Commons Attribution 2.5 Canada: https://creativecommons.org/licenses/by/2.5/ca/. Any reproduced or adapted Morin material retains that license and attribution requirement; this project’s CC0 dedication does not waive his rights. The companion adds a dungeon setting, focused workshops, renamed and simplified implementations, tests, instructor guidance, and AI learning activities. No endorsement by Pat Morin is implied.</w:t>
+      </w:r>
+    </w:p>
+    <w:p>
+      <w:r>
+        <w:t>Format inspiration: Michael Penta, Companion Materials for OpenStax: Introduction to Python Programming, Chapter 5 (2025), supplied under CC0 1.0. Other third-party material retains its applicable terms. CC0 applies only to rights held by the project rights holders and does not assert that AI-generated material is copyrightable.</w:t>
+      </w:r>
+    </w:p>
+    <w:p>
+      <w:pPr>
+        <w:pStyle w:val="Heading2"/>
+      </w:pPr>
+      <w:r>
+        <w:t>AI Disclosure</w:t>
+      </w:r>
+    </w:p>
+    <w:p>
+      <w:r>
+        <w:t>This work was AI-created, human-prompted, human-edited, and human-verified. Text, instructional activities, and code were generated using ChatGPT (OpenAI). Decorative artwork was generated using OpenAI image generation.</w:t>
+      </w:r>
+    </w:p>
+    <w:p>
+      <w:r>
+        <w:t>AI tool citation: OpenAI. (2026). ChatGPT [large language model]. https://chatgpt.com/. Exact model-version identifiers were not recorded. Human prompting, editing, and verification do not imply that the work is error-free or that classroom trials have been completed.</w:t>
       </w:r>
     </w:p>
     <w:sectPr>

</xml_diff>

<commit_message>
Apply reviewed publication package with portable attribution and source map
</commit_message>
<xml_diff>
--- a/docs/Data_Dungeon_Book_Plan.docx
+++ b/docs/Data_Dungeon_Book_Plan.docx
@@ -30,7 +30,7 @@
         <w:jc w:val="center"/>
       </w:pPr>
       <w:r>
-        <w:t>Book Plan and Chapter Alignment</w:t>
+        <w:t>Complete Scope and Chapter Alignment</w:t>
       </w:r>
     </w:p>
     <w:p>
@@ -121,7 +121,7 @@
     </w:p>
     <w:p>
       <w:r>
-        <w:t>The companion will be distributed as editable Word chapter documents with a separate Word instructor guide. Code listings appear in the chapter materials; runnable Java projects can accompany the final release. Each chapter supplies its own complete starting point.</w:t>
+        <w:t>The companion contains editable Word student chapters and instructor guides, plus runnable Java starter and reference projects. Each activity supplies its own complete starting point. Chapters 1–6 and 10–12, plus the circular-queue workshop, are the entire planned collection.</w:t>
       </w:r>
     </w:p>
     <w:p>
@@ -331,7 +331,7 @@
         <w:pStyle w:val="Heading1"/>
       </w:pPr>
       <w:r>
-        <w:t>Later Adventures and Publication Plan</w:t>
+        <w:t>Remaining Chapters and Publication Scope</w:t>
       </w:r>
     </w:p>
     <w:p>
@@ -383,12 +383,12 @@
     </w:p>
     <w:p>
       <w:r>
-        <w:t>Morin: Graphs. Find reachable rooms and shortest routes in an unweighted dungeon. AI practice: Create and check a BFS or DFS visualization.</w:t>
-      </w:r>
-    </w:p>
-    <w:p>
-      <w:r>
-        <w:t>Chapters 7–9 are candidates for optional archive extensions. Chapters 13–14 are outside the first release. Numbering follows the textbook; coverage within each chapter is selective.</w:t>
+        <w:t>Morin: Graphs. Find reachable rooms and shortest routes in an unweighted dungeon. AI practice: Create and check a BFS visualization.</w:t>
+      </w:r>
+    </w:p>
+    <w:p>
+      <w:r>
+        <w:t>The complete scope is Chapters 1–6 and 10–12, plus the Chapter 2 circular-queue workshop. No additional chapters are planned. Numbering follows Morin; coverage is selective.</w:t>
       </w:r>
     </w:p>
     <w:p>
@@ -406,7 +406,7 @@
     </w:p>
     <w:p>
       <w:r>
-        <w:t>The first draft includes a runnable navigation foundation in its Word appendix. Item and inventory classes enter with Chapter 2. Later chapters receive complete supporting implementations so earlier assignments are not prerequisites.</w:t>
+        <w:t>Chapter 1 includes a runnable navigation foundation and a Word code appendix. Item and inventory classes enter with Chapter 2. All other activities include supporting implementations, so earlier assignments are not prerequisites.</w:t>
       </w:r>
     </w:p>
     <w:p>
@@ -457,7 +457,7 @@
     </w:p>
     <w:p>
       <w:r>
-        <w:t>Pat Morin, Open Data Structures, Java edition: https://opendatastructures.org/ods-java/. The textbook and its accompanying source code are released under Creative Commons Attribution 2.5 Canada: https://creativecommons.org/licenses/by/2.5/ca/. Any reproduced or adapted Morin material retains that license and attribution requirement; this project’s CC0 dedication does not waive his rights. The companion adds a dungeon setting, focused workshops, renamed and simplified implementations, tests, instructor guidance, and AI learning activities. No endorsement by Pat Morin is implied.</w:t>
+        <w:t>Pat Morin, Open Data Structures (Java edition 0.1G): https://opendatastructures.org/ods-java/. The textbook and source code are licensed under CC BY 2.5 Canada: https://creativecommons.org/licenses/by/2.5/ca/. This companion adapts selected topics for dungeon workshops with renamed and simplified structures, new contracts, tests, and AI learning activities. Morin material retains its license, attribution, copyright notices, and warranty disclaimers; CC0 covers only original project contributions. Keep this credit and the license link with redistributed adaptations, including extracted code. No endorsement by Pat Morin is implied.</w:t>
       </w:r>
     </w:p>
     <w:p>

</xml_diff>